<commit_message>
Das schlechte Gewissen: Dopplungen gestrafft, Lektorats-Befund
Zwei unabhaengige Lektorats-Durchlaeufe, Ziel: spannend, kein generischer
Fuellstoff. Fuenf chirurgische Korrekturen: Krisen-Block stand wortgleich
im Vorwort UND am Buchende (Dopplung am Ende auf Verweis gekuerzt), die
Formel "Gewissen kommt, zeigt auf etwas, geht" lief fast wortgleich in
Kapitel 1/3/14 (nur in Kapitel 3 voll belassen), eine Kapitelend-Formel
wiederholte sich in Kapitel 8/9/10/12 (zwei individualisiert), die
Wellness-Liste in Kapitel 12 und die generische Affirmation in "Ein Brief
an dich" durch buch-eigene Sprache ersetzt. Kernstellen (Kap. 1, 3, 6, 7,
9, 11, 13, Sophias Geschichte) unangetastet.

buch-pruefen.py: keine neuen Befunde. Seiten 106 -> 106 (nach Korrektur
der Tabellen-Luecke aus dem vorigen Commit unveraendert).

Co-Authored-By: Claude Sonnet 5 <noreply@anthropic.com>
Claude-Session: https://claude.ai/code/session_011oFtWvyjvkDdc6K2GcSXHx
</commit_message>
<xml_diff>
--- a/outputs/buch-schuldgefuehle/das-schlechte-gewissen-Taschenbuch.docx
+++ b/outputs/buch-schuldgefuehle/das-schlechte-gewissen-Taschenbuch.docx
@@ -1441,7 +1441,7 @@
           <w:sz w:val="220"/>
           <w:szCs w:val="220"/>
         </w:rPr>
-        <w:t xml:space="preserve">Ein gesundes Gewissen ist präzise. Es meldet sich, wenn du etwas getan oder unterlassen hast, das gegen deine eigenen Werte verstösst. Du weisst, wofür du dich schämst oder bereust. Es motiviert zur Wiedergutmachung, zu einem aufrichtigen Gespräch, zu einer Korrektur des eigenen Verhaltens. Und wenn das geschehen ist, löst es sich auf. Das gesunde Gewissen hat ein Ende. Es kommt, tut seine Arbeit, und geht. Es ist ein Wegweiser, kein Bewohner.</w:t>
+        <w:t>Ein gesundes Gewissen ist präzise. Es meldet sich, wenn du etwas getan oder unterlassen hast, das gegen deine eigenen Werte verstösst, und löst sich wieder auf, sobald du reagierst. Es hat ein Ende. Wie genau du das eine vom anderen unterscheidest, zeigt Kapitel 3.</w:t>
       </w:r>
     </w:p>
     <w:p>
@@ -4651,7 +4651,7 @@
           <w:sz w:val="220"/>
           <w:szCs w:val="220"/>
         </w:rPr>
-        <w:t xml:space="preserve">Das ist der Beginn einer anderen Art, mit sich selbst zu sein.</w:t>
+        <w:t>Der Nacken zieht manchmal noch. Aber Hanna fragt inzwischen nach, bevor sie zur nächsten Massage greift.</w:t>
       </w:r>
     </w:p>
     <w:p>
@@ -6168,7 +6168,7 @@
           <w:sz w:val="220"/>
           <w:szCs w:val="220"/>
         </w:rPr>
-        <w:t xml:space="preserve">Schlaf. Nicht als Luxus, sondern als biologische Notwendigkeit. Zeit, in der wir nichts leisten. Nicht Pausen zwischen Aufgaben, sondern echte Stille. Momente, in denen das Schuldgefühl vielleicht kommt und fragt: Was machst du hier? Und wir trotzdem bleiben. Essen, das gut ist, nicht nur schnell. Bewegung, die wir mögen, nicht nur erledigen. Gespräche, die uns nähren, nicht nur verbrauchen. Beziehungen, in denen wir empfangen dürfen, nicht nur geben.</w:t>
+        <w:t>Nicht die immer gleiche Liste aus Schlaf, Ernährung und Bewegung, die du ohnehin schon kennst. Sondern die Frage, die das chronische Schuldgefühl nie zulässt: Ist das echte Erschöpfung, oder ist es das alte Pflicht-Muster, das dir sagt, du müsstest noch mehr geben? Nur du kannst das beantworten. Und die Antwort ändert sich von Woche zu Woche.</w:t>
       </w:r>
     </w:p>
     <w:p>
@@ -6219,7 +6219,7 @@
           <w:sz w:val="220"/>
           <w:szCs w:val="220"/>
         </w:rPr>
-        <w:t xml:space="preserve">Das ist kein Egoismus. Das ist Weisheit.</w:t>
+        <w:t>Das Gefäss ist nach einem Nachmittag nicht plötzlich voll. Aber Marie weiss jetzt, dass sie es füllen darf.</w:t>
       </w:r>
     </w:p>
     <w:p>
@@ -6952,7 +6952,7 @@
           <w:sz w:val="220"/>
           <w:szCs w:val="220"/>
         </w:rPr>
-        <w:t xml:space="preserve">Sophia hat noch immer Momente, wo sie merkt, dass sie etwas besser hätte machen können. Wo sie sich aufrichtig entschuldigt, wenn sie jemanden verletzt hat. Das gesunde Gewissen ist noch da. Es kommt, zeigt auf etwas Konkretes, und geht wieder. Es hat ein Ende.</w:t>
+        <w:t>Sophia hat noch immer Momente, wo sie merkt, dass sie etwas besser hätte machen können. Wo sie sich aufrichtig entschuldigt, wenn sie jemanden verletzt hat. Das gesunde Gewissen aus Kapitel 3 ist noch da. Der Unterschied zu früher: Sie hört ihm zu, statt sich von ihm verwalten zu lassen.</w:t>
       </w:r>
     </w:p>
     <w:p>
@@ -7395,24 +7395,24 @@
           <w:sz w:val="220"/>
           <w:szCs w:val="220"/>
         </w:rPr>
-        <w:t xml:space="preserve">Du bist genug. Du warst es immer.</w:t>
-      </w:r>
-    </w:p>
-    <w:p>
-      <w:pPr>
-        <w:spacing w:after="120" w:before="0"/>
-        <w:jc w:val="both"/>
-      </w:pPr>
-      <w:r>
-        <w:rPr>
-          <w:rFonts w:ascii="Georgia" w:cs="Georgia" w:eastAsia="Georgia" w:hAnsi="Georgia"/>
-          <w:b w:val="false"/>
-          <w:bCs w:val="false"/>
-          <w:color w:val="2C2C2C"/>
-          <w:sz w:val="220"/>
-          <w:szCs w:val="220"/>
-        </w:rPr>
-        <w:t xml:space="preserve">Nicht weil du alles richtig gemacht hast. Nicht weil du niemanden enttäuscht hast. Nicht weil du perfekt warst oder weil alle zufrieden sind. Sondern weil Genug-Sein nicht an Bedingungen geknüpft ist. Weil du nicht erst etwas verdienen musst, um zu existieren.</w:t>
+        <w:t>Das Schuldgefühl war lange deine heimliche Chefin. Zeit, dass wieder du entscheidest.</w:t>
+      </w:r>
+    </w:p>
+    <w:p>
+      <w:pPr>
+        <w:spacing w:after="120" w:before="0"/>
+        <w:jc w:val="both"/>
+      </w:pPr>
+      <w:r>
+        <w:rPr>
+          <w:rFonts w:ascii="Georgia" w:cs="Georgia" w:eastAsia="Georgia" w:hAnsi="Georgia"/>
+          <w:b w:val="false"/>
+          <w:bCs w:val="false"/>
+          <w:color w:val="2C2C2C"/>
+          <w:sz w:val="220"/>
+          <w:szCs w:val="220"/>
+        </w:rPr>
+        <w:t>Nicht weil du alles richtig gemacht hast. Nicht weil du niemanden enttäuscht hast. Nicht weil du perfekt warst oder weil alle zufrieden sind. Sondern weil ein Alarm kein Urteil ist. Und weil Reue, die nach vorne schaut, mehr wert ist als ein Gewissen, das nur zurückblickt.</w:t>
       </w:r>
     </w:p>
     <w:p>
@@ -8181,53 +8181,9 @@
           <w:rFonts w:ascii="Georgia" w:hAnsi="Georgia"/>
           <w:b w:val="0"/>
           <w:i w:val="0"/>
-          <w:sz w:val="34"/>
-        </w:rPr>
-        <w:t>Und wenn es mehr ist als ein schlechter Tag</w:t>
-      </w:r>
-    </w:p>
-    <w:p>
-      <w:r>
-        <w:rPr>
-          <w:rFonts w:ascii="Georgia" w:hAnsi="Georgia"/>
-          <w:b w:val="0"/>
-          <w:i w:val="0"/>
           <w:sz w:val="22"/>
         </w:rPr>
-        <w:t>Wenn du seit Wochen nicht mehr herauskommst. Wenn du nachts wach liegst und denkst, dass es ohne dich leichter wäre.</w:t>
-      </w:r>
-    </w:p>
-    <w:p>
-      <w:r>
-        <w:rPr>
-          <w:rFonts w:ascii="Georgia" w:hAnsi="Georgia"/>
-          <w:b w:val="0"/>
-          <w:i w:val="0"/>
-          <w:sz w:val="22"/>
-        </w:rPr>
-        <w:t>Dann ist dieses Buch nicht genug. Das ist keine Schwäche, das ist einfach so.</w:t>
-      </w:r>
-    </w:p>
-    <w:p>
-      <w:r>
-        <w:rPr>
-          <w:rFonts w:ascii="Georgia" w:hAnsi="Georgia"/>
-          <w:b w:val="0"/>
-          <w:i w:val="0"/>
-          <w:sz w:val="22"/>
-        </w:rPr>
-        <w:t>Ruf an. Kostenlos, anonym, Tag und Nacht besetzt.</w:t>
-      </w:r>
-    </w:p>
-    <w:p>
-      <w:r>
-        <w:rPr>
-          <w:rFonts w:ascii="Georgia" w:hAnsi="Georgia"/>
-          <w:b w:val="0"/>
-          <w:i w:val="0"/>
-          <w:sz w:val="22"/>
-        </w:rPr>
-        <w:t>Schweiz 143 · Deutschland 0800 111 0 111 · Österreich 142</w:t>
+        <w:t>Geht es dir gerade schlechter als nur an einem einzelnen Tag? Die Nummern dafür stehen am Anfang dieses Buches und noch einmal unter „Notfall und professionelle Hilfe“ weiter oben.</w:t>
       </w:r>
     </w:p>
     <w:p/>

</xml_diff>

<commit_message>
Das schlechte Gewissen: "Praxis" in der Danksagung durch coachin-konforme Sprache ersetzt
Von der Gegenlesung separat gefundener Altbestand (ausserhalb des heutigen
Korrektur-Diffs): "die ich in meiner Praxis sehe" und "In meiner Praxis, in
Kursen..." in der Danksagung. "Praxis" impliziert klinische Taetigkeit,
siehe bereits dokumentierte Regel in rechtssicherheit.md. Ersetzt durch
"in meiner Arbeit als Coachin" bzw. "In Coaching-Gespraechen".

buch-pruefen.py unveraendert (41 Befunde), Seiten 106 -> 106.

Co-Authored-By: Claude Sonnet 5 <noreply@anthropic.com>
Claude-Session: https://claude.ai/code/session_011oFtWvyjvkDdc6K2GcSXHx
</commit_message>
<xml_diff>
--- a/outputs/buch-schuldgefuehle/das-schlechte-gewissen-Taschenbuch.docx
+++ b/outputs/buch-schuldgefuehle/das-schlechte-gewissen-Taschenbuch.docx
@@ -2753,7 +2753,7 @@
           <w:sz w:val="220"/>
           <w:szCs w:val="220"/>
         </w:rPr>
-        <w:t xml:space="preserve">Ich kenne dieses Muster sehr gut. Es gehört zu den häufigsten Dingen, die ich in meiner Praxis sehe. Und es hat fast immer dieselbe Wurzel.</w:t>
+        <w:t>Ich kenne dieses Muster sehr gut. Es gehört zu den häufigsten Dingen, die ich in meiner Arbeit als Coachin sehe. Und es hat fast immer dieselbe Wurzel.</w:t>
       </w:r>
     </w:p>
     <w:p>
@@ -7532,7 +7532,7 @@
           <w:sz w:val="220"/>
           <w:szCs w:val="220"/>
         </w:rPr>
-        <w:t xml:space="preserve">Dieses Buch ist entstanden aus Hunderten von Gesprächen mit Frauen, die mir ihr Vertrauen geschenkt haben. In meiner Praxis, in Kursen, in zufälligen Momenten, in denen jemand etwas gesagt hat, das ich nie vergessen habe. Ihnen gilt mein tiefster Dank. Ohne diese Gespräche wäre dieses Buch nicht möglich gewesen.</w:t>
+        <w:t>Dieses Buch ist entstanden aus Hunderten von Gesprächen mit Frauen, die mir ihr Vertrauen geschenkt haben. In Coaching-Gesprächen, in Kursen, in zufälligen Momenten, in denen jemand etwas gesagt hat, das ich nie vergessen habe. Ihnen gilt mein tiefster Dank. Ohne diese Gespräche wäre dieses Buch nicht möglich gewesen.</w:t>
       </w:r>
     </w:p>
     <w:p>

</xml_diff>